<commit_message>
se agrega img de mantto y actualizacion de plantilla de gasolinera
</commit_message>
<xml_diff>
--- a/Inputs/Templates/GRI Gasolinera.docx
+++ b/Inputs/Templates/GRI Gasolinera.docx
@@ -1,6 +1,6 @@
 
 <file path=word/document.xml><?xml version="1.0" encoding="utf-8"?>
-<w:document xmlns:wpc="http://schemas.microsoft.com/office/word/2010/wordprocessingCanvas" xmlns:cx="http://schemas.microsoft.com/office/drawing/2014/chartex" xmlns:cx1="http://schemas.microsoft.com/office/drawing/2015/9/8/chartex" xmlns:cx2="http://schemas.microsoft.com/office/drawing/2015/10/21/chartex" xmlns:cx3="http://schemas.microsoft.com/office/drawing/2016/5/9/chartex" xmlns:cx4="http://schemas.microsoft.com/office/drawing/2016/5/10/chartex" xmlns:cx5="http://schemas.microsoft.com/office/drawing/2016/5/11/chartex" xmlns:cx6="http://schemas.microsoft.com/office/drawing/2016/5/12/chartex" xmlns:cx7="http://schemas.microsoft.com/office/drawing/2016/5/13/chartex" xmlns:cx8="http://schemas.microsoft.com/office/drawing/2016/5/14/chartex" xmlns:mc="http://schemas.openxmlformats.org/markup-compatibility/2006" xmlns:aink="http://schemas.microsoft.com/office/drawing/2016/ink" xmlns:am3d="http://schemas.microsoft.com/office/drawing/2017/model3d" xmlns:o="urn:schemas-microsoft-com:office:office" xmlns:oel="http://schemas.microsoft.com/office/2019/extlst" xmlns:r="http://schemas.openxmlformats.org/officeDocument/2006/relationships" xmlns:m="http://schemas.openxmlformats.org/officeDocument/2006/math" xmlns:v="urn:schemas-microsoft-com:vml" xmlns:wp14="http://schemas.microsoft.com/office/word/2010/wordprocessingDrawing" xmlns:wp="http://schemas.openxmlformats.org/drawingml/2006/wordprocessingDrawing" xmlns:w10="urn:schemas-microsoft-com:office:word" xmlns:w="http://schemas.openxmlformats.org/wordprocessingml/2006/main" xmlns:w14="http://schemas.microsoft.com/office/word/2010/wordml" xmlns:w15="http://schemas.microsoft.com/office/word/2012/wordml" xmlns:w16cex="http://schemas.microsoft.com/office/word/2018/wordml/cex" xmlns:w16cid="http://schemas.microsoft.com/office/word/2016/wordml/cid" xmlns:w16="http://schemas.microsoft.com/office/word/2018/wordml" xmlns:w16sdtdh="http://schemas.microsoft.com/office/word/2020/wordml/sdtdatahash" xmlns:w16se="http://schemas.microsoft.com/office/word/2015/wordml/symex" xmlns:wpg="http://schemas.microsoft.com/office/word/2010/wordprocessingGroup" xmlns:wpi="http://schemas.microsoft.com/office/word/2010/wordprocessingInk" xmlns:wne="http://schemas.microsoft.com/office/word/2006/wordml" xmlns:wps="http://schemas.microsoft.com/office/word/2010/wordprocessingShape" mc:Ignorable="w14 w15 w16se w16cid w16 w16cex w16sdtdh wp14">
+<w:document xmlns:wpc="http://schemas.microsoft.com/office/word/2010/wordprocessingCanvas" xmlns:cx="http://schemas.microsoft.com/office/drawing/2014/chartex" xmlns:cx1="http://schemas.microsoft.com/office/drawing/2015/9/8/chartex" xmlns:cx2="http://schemas.microsoft.com/office/drawing/2015/10/21/chartex" xmlns:cx3="http://schemas.microsoft.com/office/drawing/2016/5/9/chartex" xmlns:cx4="http://schemas.microsoft.com/office/drawing/2016/5/10/chartex" xmlns:cx5="http://schemas.microsoft.com/office/drawing/2016/5/11/chartex" xmlns:cx6="http://schemas.microsoft.com/office/drawing/2016/5/12/chartex" xmlns:cx7="http://schemas.microsoft.com/office/drawing/2016/5/13/chartex" xmlns:cx8="http://schemas.microsoft.com/office/drawing/2016/5/14/chartex" xmlns:mc="http://schemas.openxmlformats.org/markup-compatibility/2006" xmlns:aink="http://schemas.microsoft.com/office/drawing/2016/ink" xmlns:am3d="http://schemas.microsoft.com/office/drawing/2017/model3d" xmlns:o="urn:schemas-microsoft-com:office:office" xmlns:oel="http://schemas.microsoft.com/office/2019/extlst" xmlns:r="http://schemas.openxmlformats.org/officeDocument/2006/relationships" xmlns:m="http://schemas.openxmlformats.org/officeDocument/2006/math" xmlns:v="urn:schemas-microsoft-com:vml" xmlns:wp14="http://schemas.microsoft.com/office/word/2010/wordprocessingDrawing" xmlns:wp="http://schemas.openxmlformats.org/drawingml/2006/wordprocessingDrawing" xmlns:w10="urn:schemas-microsoft-com:office:word" xmlns:w="http://schemas.openxmlformats.org/wordprocessingml/2006/main" xmlns:w14="http://schemas.microsoft.com/office/word/2010/wordml" xmlns:w15="http://schemas.microsoft.com/office/word/2012/wordml" xmlns:w16cex="http://schemas.microsoft.com/office/word/2018/wordml/cex" xmlns:w16cid="http://schemas.microsoft.com/office/word/2016/wordml/cid" xmlns:w16="http://schemas.microsoft.com/office/word/2018/wordml" xmlns:w16du="http://schemas.microsoft.com/office/word/2023/wordml/word16du" xmlns:w16sdtdh="http://schemas.microsoft.com/office/word/2020/wordml/sdtdatahash" xmlns:w16se="http://schemas.microsoft.com/office/word/2015/wordml/symex" xmlns:wpg="http://schemas.microsoft.com/office/word/2010/wordprocessingGroup" xmlns:wpi="http://schemas.microsoft.com/office/word/2010/wordprocessingInk" xmlns:wne="http://schemas.microsoft.com/office/word/2006/wordml" xmlns:wps="http://schemas.microsoft.com/office/word/2010/wordprocessingShape" mc:Ignorable="w14 w15 w16se w16cid w16 w16cex w16sdtdh w16du wp14">
   <w:body>
     <w:p>
       <w:pPr>
@@ -13169,7 +13169,7 @@
 </file>
 
 <file path=word/endnotes.xml><?xml version="1.0" encoding="utf-8"?>
-<w:endnotes xmlns:wpc="http://schemas.microsoft.com/office/word/2010/wordprocessingCanvas" xmlns:cx="http://schemas.microsoft.com/office/drawing/2014/chartex" xmlns:cx1="http://schemas.microsoft.com/office/drawing/2015/9/8/chartex" xmlns:cx2="http://schemas.microsoft.com/office/drawing/2015/10/21/chartex" xmlns:cx3="http://schemas.microsoft.com/office/drawing/2016/5/9/chartex" xmlns:cx4="http://schemas.microsoft.com/office/drawing/2016/5/10/chartex" xmlns:cx5="http://schemas.microsoft.com/office/drawing/2016/5/11/chartex" xmlns:cx6="http://schemas.microsoft.com/office/drawing/2016/5/12/chartex" xmlns:cx7="http://schemas.microsoft.com/office/drawing/2016/5/13/chartex" xmlns:cx8="http://schemas.microsoft.com/office/drawing/2016/5/14/chartex" xmlns:mc="http://schemas.openxmlformats.org/markup-compatibility/2006" xmlns:aink="http://schemas.microsoft.com/office/drawing/2016/ink" xmlns:am3d="http://schemas.microsoft.com/office/drawing/2017/model3d" xmlns:o="urn:schemas-microsoft-com:office:office" xmlns:oel="http://schemas.microsoft.com/office/2019/extlst" xmlns:r="http://schemas.openxmlformats.org/officeDocument/2006/relationships" xmlns:m="http://schemas.openxmlformats.org/officeDocument/2006/math" xmlns:v="urn:schemas-microsoft-com:vml" xmlns:wp14="http://schemas.microsoft.com/office/word/2010/wordprocessingDrawing" xmlns:wp="http://schemas.openxmlformats.org/drawingml/2006/wordprocessingDrawing" xmlns:w10="urn:schemas-microsoft-com:office:word" xmlns:w="http://schemas.openxmlformats.org/wordprocessingml/2006/main" xmlns:w14="http://schemas.microsoft.com/office/word/2010/wordml" xmlns:w15="http://schemas.microsoft.com/office/word/2012/wordml" xmlns:w16cex="http://schemas.microsoft.com/office/word/2018/wordml/cex" xmlns:w16cid="http://schemas.microsoft.com/office/word/2016/wordml/cid" xmlns:w16="http://schemas.microsoft.com/office/word/2018/wordml" xmlns:w16sdtdh="http://schemas.microsoft.com/office/word/2020/wordml/sdtdatahash" xmlns:w16se="http://schemas.microsoft.com/office/word/2015/wordml/symex" xmlns:wpg="http://schemas.microsoft.com/office/word/2010/wordprocessingGroup" xmlns:wpi="http://schemas.microsoft.com/office/word/2010/wordprocessingInk" xmlns:wne="http://schemas.microsoft.com/office/word/2006/wordml" xmlns:wps="http://schemas.microsoft.com/office/word/2010/wordprocessingShape" mc:Ignorable="w14 w15 w16se w16cid w16 w16cex w16sdtdh wp14">
+<w:endnotes xmlns:wpc="http://schemas.microsoft.com/office/word/2010/wordprocessingCanvas" xmlns:cx="http://schemas.microsoft.com/office/drawing/2014/chartex" xmlns:cx1="http://schemas.microsoft.com/office/drawing/2015/9/8/chartex" xmlns:cx2="http://schemas.microsoft.com/office/drawing/2015/10/21/chartex" xmlns:cx3="http://schemas.microsoft.com/office/drawing/2016/5/9/chartex" xmlns:cx4="http://schemas.microsoft.com/office/drawing/2016/5/10/chartex" xmlns:cx5="http://schemas.microsoft.com/office/drawing/2016/5/11/chartex" xmlns:cx6="http://schemas.microsoft.com/office/drawing/2016/5/12/chartex" xmlns:cx7="http://schemas.microsoft.com/office/drawing/2016/5/13/chartex" xmlns:cx8="http://schemas.microsoft.com/office/drawing/2016/5/14/chartex" xmlns:mc="http://schemas.openxmlformats.org/markup-compatibility/2006" xmlns:aink="http://schemas.microsoft.com/office/drawing/2016/ink" xmlns:am3d="http://schemas.microsoft.com/office/drawing/2017/model3d" xmlns:o="urn:schemas-microsoft-com:office:office" xmlns:oel="http://schemas.microsoft.com/office/2019/extlst" xmlns:r="http://schemas.openxmlformats.org/officeDocument/2006/relationships" xmlns:m="http://schemas.openxmlformats.org/officeDocument/2006/math" xmlns:v="urn:schemas-microsoft-com:vml" xmlns:wp14="http://schemas.microsoft.com/office/word/2010/wordprocessingDrawing" xmlns:wp="http://schemas.openxmlformats.org/drawingml/2006/wordprocessingDrawing" xmlns:w10="urn:schemas-microsoft-com:office:word" xmlns:w="http://schemas.openxmlformats.org/wordprocessingml/2006/main" xmlns:w14="http://schemas.microsoft.com/office/word/2010/wordml" xmlns:w15="http://schemas.microsoft.com/office/word/2012/wordml" xmlns:w16cex="http://schemas.microsoft.com/office/word/2018/wordml/cex" xmlns:w16cid="http://schemas.microsoft.com/office/word/2016/wordml/cid" xmlns:w16="http://schemas.microsoft.com/office/word/2018/wordml" xmlns:w16du="http://schemas.microsoft.com/office/word/2023/wordml/word16du" xmlns:w16sdtdh="http://schemas.microsoft.com/office/word/2020/wordml/sdtdatahash" xmlns:w16se="http://schemas.microsoft.com/office/word/2015/wordml/symex" xmlns:wpg="http://schemas.microsoft.com/office/word/2010/wordprocessingGroup" xmlns:wpi="http://schemas.microsoft.com/office/word/2010/wordprocessingInk" xmlns:wne="http://schemas.microsoft.com/office/word/2006/wordml" xmlns:wps="http://schemas.microsoft.com/office/word/2010/wordprocessingShape" mc:Ignorable="w14 w15 w16se w16cid w16 w16cex w16sdtdh w16du wp14">
   <w:endnote w:type="separator" w:id="-1">
     <w:p>
       <w:pPr>
@@ -13194,7 +13194,7 @@
 </file>
 
 <file path=word/footer1.xml><?xml version="1.0" encoding="utf-8"?>
-<w:ftr xmlns:wpc="http://schemas.microsoft.com/office/word/2010/wordprocessingCanvas" xmlns:cx="http://schemas.microsoft.com/office/drawing/2014/chartex" xmlns:cx1="http://schemas.microsoft.com/office/drawing/2015/9/8/chartex" xmlns:cx2="http://schemas.microsoft.com/office/drawing/2015/10/21/chartex" xmlns:cx3="http://schemas.microsoft.com/office/drawing/2016/5/9/chartex" xmlns:cx4="http://schemas.microsoft.com/office/drawing/2016/5/10/chartex" xmlns:cx5="http://schemas.microsoft.com/office/drawing/2016/5/11/chartex" xmlns:cx6="http://schemas.microsoft.com/office/drawing/2016/5/12/chartex" xmlns:cx7="http://schemas.microsoft.com/office/drawing/2016/5/13/chartex" xmlns:cx8="http://schemas.microsoft.com/office/drawing/2016/5/14/chartex" xmlns:mc="http://schemas.openxmlformats.org/markup-compatibility/2006" xmlns:aink="http://schemas.microsoft.com/office/drawing/2016/ink" xmlns:am3d="http://schemas.microsoft.com/office/drawing/2017/model3d" xmlns:o="urn:schemas-microsoft-com:office:office" xmlns:oel="http://schemas.microsoft.com/office/2019/extlst" xmlns:r="http://schemas.openxmlformats.org/officeDocument/2006/relationships" xmlns:m="http://schemas.openxmlformats.org/officeDocument/2006/math" xmlns:v="urn:schemas-microsoft-com:vml" xmlns:wp14="http://schemas.microsoft.com/office/word/2010/wordprocessingDrawing" xmlns:wp="http://schemas.openxmlformats.org/drawingml/2006/wordprocessingDrawing" xmlns:w10="urn:schemas-microsoft-com:office:word" xmlns:w="http://schemas.openxmlformats.org/wordprocessingml/2006/main" xmlns:w14="http://schemas.microsoft.com/office/word/2010/wordml" xmlns:w15="http://schemas.microsoft.com/office/word/2012/wordml" xmlns:w16cex="http://schemas.microsoft.com/office/word/2018/wordml/cex" xmlns:w16cid="http://schemas.microsoft.com/office/word/2016/wordml/cid" xmlns:w16="http://schemas.microsoft.com/office/word/2018/wordml" xmlns:w16sdtdh="http://schemas.microsoft.com/office/word/2020/wordml/sdtdatahash" xmlns:w16se="http://schemas.microsoft.com/office/word/2015/wordml/symex" xmlns:wpg="http://schemas.microsoft.com/office/word/2010/wordprocessingGroup" xmlns:wpi="http://schemas.microsoft.com/office/word/2010/wordprocessingInk" xmlns:wne="http://schemas.microsoft.com/office/word/2006/wordml" xmlns:wps="http://schemas.microsoft.com/office/word/2010/wordprocessingShape" mc:Ignorable="w14 w15 w16se w16cid w16 w16cex w16sdtdh wp14">
+<w:ftr xmlns:wpc="http://schemas.microsoft.com/office/word/2010/wordprocessingCanvas" xmlns:cx="http://schemas.microsoft.com/office/drawing/2014/chartex" xmlns:cx1="http://schemas.microsoft.com/office/drawing/2015/9/8/chartex" xmlns:cx2="http://schemas.microsoft.com/office/drawing/2015/10/21/chartex" xmlns:cx3="http://schemas.microsoft.com/office/drawing/2016/5/9/chartex" xmlns:cx4="http://schemas.microsoft.com/office/drawing/2016/5/10/chartex" xmlns:cx5="http://schemas.microsoft.com/office/drawing/2016/5/11/chartex" xmlns:cx6="http://schemas.microsoft.com/office/drawing/2016/5/12/chartex" xmlns:cx7="http://schemas.microsoft.com/office/drawing/2016/5/13/chartex" xmlns:cx8="http://schemas.microsoft.com/office/drawing/2016/5/14/chartex" xmlns:mc="http://schemas.openxmlformats.org/markup-compatibility/2006" xmlns:aink="http://schemas.microsoft.com/office/drawing/2016/ink" xmlns:am3d="http://schemas.microsoft.com/office/drawing/2017/model3d" xmlns:o="urn:schemas-microsoft-com:office:office" xmlns:oel="http://schemas.microsoft.com/office/2019/extlst" xmlns:r="http://schemas.openxmlformats.org/officeDocument/2006/relationships" xmlns:m="http://schemas.openxmlformats.org/officeDocument/2006/math" xmlns:v="urn:schemas-microsoft-com:vml" xmlns:wp14="http://schemas.microsoft.com/office/word/2010/wordprocessingDrawing" xmlns:wp="http://schemas.openxmlformats.org/drawingml/2006/wordprocessingDrawing" xmlns:w10="urn:schemas-microsoft-com:office:word" xmlns:w="http://schemas.openxmlformats.org/wordprocessingml/2006/main" xmlns:w14="http://schemas.microsoft.com/office/word/2010/wordml" xmlns:w15="http://schemas.microsoft.com/office/word/2012/wordml" xmlns:w16cex="http://schemas.microsoft.com/office/word/2018/wordml/cex" xmlns:w16cid="http://schemas.microsoft.com/office/word/2016/wordml/cid" xmlns:w16="http://schemas.microsoft.com/office/word/2018/wordml" xmlns:w16du="http://schemas.microsoft.com/office/word/2023/wordml/word16du" xmlns:w16sdtdh="http://schemas.microsoft.com/office/word/2020/wordml/sdtdatahash" xmlns:w16se="http://schemas.microsoft.com/office/word/2015/wordml/symex" xmlns:wpg="http://schemas.microsoft.com/office/word/2010/wordprocessingGroup" xmlns:wpi="http://schemas.microsoft.com/office/word/2010/wordprocessingInk" xmlns:wne="http://schemas.microsoft.com/office/word/2006/wordml" xmlns:wps="http://schemas.microsoft.com/office/word/2010/wordprocessingShape" mc:Ignorable="w14 w15 w16se w16cid w16 w16cex w16sdtdh w16du wp14">
   <w:sdt>
     <w:sdtPr>
       <w:id w:val="-1610963637"/>
@@ -13203,6 +13203,7 @@
         <w:docPartUnique/>
       </w:docPartObj>
     </w:sdtPr>
+    <w:sdtEndPr/>
     <w:sdtContent>
       <w:sdt>
         <w:sdtPr>
@@ -13212,6 +13213,7 @@
             <w:docPartUnique/>
           </w:docPartObj>
         </w:sdtPr>
+        <w:sdtEndPr/>
         <w:sdtContent>
           <w:p>
             <w:pPr>
@@ -13546,7 +13548,7 @@
 </file>
 
 <file path=word/footnotes.xml><?xml version="1.0" encoding="utf-8"?>
-<w:footnotes xmlns:wpc="http://schemas.microsoft.com/office/word/2010/wordprocessingCanvas" xmlns:cx="http://schemas.microsoft.com/office/drawing/2014/chartex" xmlns:cx1="http://schemas.microsoft.com/office/drawing/2015/9/8/chartex" xmlns:cx2="http://schemas.microsoft.com/office/drawing/2015/10/21/chartex" xmlns:cx3="http://schemas.microsoft.com/office/drawing/2016/5/9/chartex" xmlns:cx4="http://schemas.microsoft.com/office/drawing/2016/5/10/chartex" xmlns:cx5="http://schemas.microsoft.com/office/drawing/2016/5/11/chartex" xmlns:cx6="http://schemas.microsoft.com/office/drawing/2016/5/12/chartex" xmlns:cx7="http://schemas.microsoft.com/office/drawing/2016/5/13/chartex" xmlns:cx8="http://schemas.microsoft.com/office/drawing/2016/5/14/chartex" xmlns:mc="http://schemas.openxmlformats.org/markup-compatibility/2006" xmlns:aink="http://schemas.microsoft.com/office/drawing/2016/ink" xmlns:am3d="http://schemas.microsoft.com/office/drawing/2017/model3d" xmlns:o="urn:schemas-microsoft-com:office:office" xmlns:oel="http://schemas.microsoft.com/office/2019/extlst" xmlns:r="http://schemas.openxmlformats.org/officeDocument/2006/relationships" xmlns:m="http://schemas.openxmlformats.org/officeDocument/2006/math" xmlns:v="urn:schemas-microsoft-com:vml" xmlns:wp14="http://schemas.microsoft.com/office/word/2010/wordprocessingDrawing" xmlns:wp="http://schemas.openxmlformats.org/drawingml/2006/wordprocessingDrawing" xmlns:w10="urn:schemas-microsoft-com:office:word" xmlns:w="http://schemas.openxmlformats.org/wordprocessingml/2006/main" xmlns:w14="http://schemas.microsoft.com/office/word/2010/wordml" xmlns:w15="http://schemas.microsoft.com/office/word/2012/wordml" xmlns:w16cex="http://schemas.microsoft.com/office/word/2018/wordml/cex" xmlns:w16cid="http://schemas.microsoft.com/office/word/2016/wordml/cid" xmlns:w16="http://schemas.microsoft.com/office/word/2018/wordml" xmlns:w16sdtdh="http://schemas.microsoft.com/office/word/2020/wordml/sdtdatahash" xmlns:w16se="http://schemas.microsoft.com/office/word/2015/wordml/symex" xmlns:wpg="http://schemas.microsoft.com/office/word/2010/wordprocessingGroup" xmlns:wpi="http://schemas.microsoft.com/office/word/2010/wordprocessingInk" xmlns:wne="http://schemas.microsoft.com/office/word/2006/wordml" xmlns:wps="http://schemas.microsoft.com/office/word/2010/wordprocessingShape" mc:Ignorable="w14 w15 w16se w16cid w16 w16cex w16sdtdh wp14">
+<w:footnotes xmlns:wpc="http://schemas.microsoft.com/office/word/2010/wordprocessingCanvas" xmlns:cx="http://schemas.microsoft.com/office/drawing/2014/chartex" xmlns:cx1="http://schemas.microsoft.com/office/drawing/2015/9/8/chartex" xmlns:cx2="http://schemas.microsoft.com/office/drawing/2015/10/21/chartex" xmlns:cx3="http://schemas.microsoft.com/office/drawing/2016/5/9/chartex" xmlns:cx4="http://schemas.microsoft.com/office/drawing/2016/5/10/chartex" xmlns:cx5="http://schemas.microsoft.com/office/drawing/2016/5/11/chartex" xmlns:cx6="http://schemas.microsoft.com/office/drawing/2016/5/12/chartex" xmlns:cx7="http://schemas.microsoft.com/office/drawing/2016/5/13/chartex" xmlns:cx8="http://schemas.microsoft.com/office/drawing/2016/5/14/chartex" xmlns:mc="http://schemas.openxmlformats.org/markup-compatibility/2006" xmlns:aink="http://schemas.microsoft.com/office/drawing/2016/ink" xmlns:am3d="http://schemas.microsoft.com/office/drawing/2017/model3d" xmlns:o="urn:schemas-microsoft-com:office:office" xmlns:oel="http://schemas.microsoft.com/office/2019/extlst" xmlns:r="http://schemas.openxmlformats.org/officeDocument/2006/relationships" xmlns:m="http://schemas.openxmlformats.org/officeDocument/2006/math" xmlns:v="urn:schemas-microsoft-com:vml" xmlns:wp14="http://schemas.microsoft.com/office/word/2010/wordprocessingDrawing" xmlns:wp="http://schemas.openxmlformats.org/drawingml/2006/wordprocessingDrawing" xmlns:w10="urn:schemas-microsoft-com:office:word" xmlns:w="http://schemas.openxmlformats.org/wordprocessingml/2006/main" xmlns:w14="http://schemas.microsoft.com/office/word/2010/wordml" xmlns:w15="http://schemas.microsoft.com/office/word/2012/wordml" xmlns:w16cex="http://schemas.microsoft.com/office/word/2018/wordml/cex" xmlns:w16cid="http://schemas.microsoft.com/office/word/2016/wordml/cid" xmlns:w16="http://schemas.microsoft.com/office/word/2018/wordml" xmlns:w16du="http://schemas.microsoft.com/office/word/2023/wordml/word16du" xmlns:w16sdtdh="http://schemas.microsoft.com/office/word/2020/wordml/sdtdatahash" xmlns:w16se="http://schemas.microsoft.com/office/word/2015/wordml/symex" xmlns:wpg="http://schemas.microsoft.com/office/word/2010/wordprocessingGroup" xmlns:wpi="http://schemas.microsoft.com/office/word/2010/wordprocessingInk" xmlns:wne="http://schemas.microsoft.com/office/word/2006/wordml" xmlns:wps="http://schemas.microsoft.com/office/word/2010/wordprocessingShape" mc:Ignorable="w14 w15 w16se w16cid w16 w16cex w16sdtdh w16du wp14">
   <w:footnote w:type="separator" w:id="-1">
     <w:p>
       <w:pPr>
@@ -13571,200 +13573,135 @@
 </file>
 
 <file path=word/header1.xml><?xml version="1.0" encoding="utf-8"?>
-<w:hdr xmlns:wpc="http://schemas.microsoft.com/office/word/2010/wordprocessingCanvas" xmlns:cx="http://schemas.microsoft.com/office/drawing/2014/chartex" xmlns:cx1="http://schemas.microsoft.com/office/drawing/2015/9/8/chartex" xmlns:cx2="http://schemas.microsoft.com/office/drawing/2015/10/21/chartex" xmlns:cx3="http://schemas.microsoft.com/office/drawing/2016/5/9/chartex" xmlns:cx4="http://schemas.microsoft.com/office/drawing/2016/5/10/chartex" xmlns:cx5="http://schemas.microsoft.com/office/drawing/2016/5/11/chartex" xmlns:cx6="http://schemas.microsoft.com/office/drawing/2016/5/12/chartex" xmlns:cx7="http://schemas.microsoft.com/office/drawing/2016/5/13/chartex" xmlns:cx8="http://schemas.microsoft.com/office/drawing/2016/5/14/chartex" xmlns:mc="http://schemas.openxmlformats.org/markup-compatibility/2006" xmlns:aink="http://schemas.microsoft.com/office/drawing/2016/ink" xmlns:am3d="http://schemas.microsoft.com/office/drawing/2017/model3d" xmlns:o="urn:schemas-microsoft-com:office:office" xmlns:oel="http://schemas.microsoft.com/office/2019/extlst" xmlns:r="http://schemas.openxmlformats.org/officeDocument/2006/relationships" xmlns:m="http://schemas.openxmlformats.org/officeDocument/2006/math" xmlns:v="urn:schemas-microsoft-com:vml" xmlns:wp14="http://schemas.microsoft.com/office/word/2010/wordprocessingDrawing" xmlns:wp="http://schemas.openxmlformats.org/drawingml/2006/wordprocessingDrawing" xmlns:w10="urn:schemas-microsoft-com:office:word" xmlns:w="http://schemas.openxmlformats.org/wordprocessingml/2006/main" xmlns:w14="http://schemas.microsoft.com/office/word/2010/wordml" xmlns:w15="http://schemas.microsoft.com/office/word/2012/wordml" xmlns:w16cex="http://schemas.microsoft.com/office/word/2018/wordml/cex" xmlns:w16cid="http://schemas.microsoft.com/office/word/2016/wordml/cid" xmlns:w16="http://schemas.microsoft.com/office/word/2018/wordml" xmlns:w16sdtdh="http://schemas.microsoft.com/office/word/2020/wordml/sdtdatahash" xmlns:w16se="http://schemas.microsoft.com/office/word/2015/wordml/symex" xmlns:wpg="http://schemas.microsoft.com/office/word/2010/wordprocessingGroup" xmlns:wpi="http://schemas.microsoft.com/office/word/2010/wordprocessingInk" xmlns:wne="http://schemas.microsoft.com/office/word/2006/wordml" xmlns:wps="http://schemas.microsoft.com/office/word/2010/wordprocessingShape" mc:Ignorable="w14 w15 w16se w16cid w16 w16cex w16sdtdh wp14">
+<w:hdr xmlns:wpc="http://schemas.microsoft.com/office/word/2010/wordprocessingCanvas" xmlns:cx="http://schemas.microsoft.com/office/drawing/2014/chartex" xmlns:cx1="http://schemas.microsoft.com/office/drawing/2015/9/8/chartex" xmlns:cx2="http://schemas.microsoft.com/office/drawing/2015/10/21/chartex" xmlns:cx3="http://schemas.microsoft.com/office/drawing/2016/5/9/chartex" xmlns:cx4="http://schemas.microsoft.com/office/drawing/2016/5/10/chartex" xmlns:cx5="http://schemas.microsoft.com/office/drawing/2016/5/11/chartex" xmlns:cx6="http://schemas.microsoft.com/office/drawing/2016/5/12/chartex" xmlns:cx7="http://schemas.microsoft.com/office/drawing/2016/5/13/chartex" xmlns:cx8="http://schemas.microsoft.com/office/drawing/2016/5/14/chartex" xmlns:mc="http://schemas.openxmlformats.org/markup-compatibility/2006" xmlns:aink="http://schemas.microsoft.com/office/drawing/2016/ink" xmlns:am3d="http://schemas.microsoft.com/office/drawing/2017/model3d" xmlns:o="urn:schemas-microsoft-com:office:office" xmlns:oel="http://schemas.microsoft.com/office/2019/extlst" xmlns:r="http://schemas.openxmlformats.org/officeDocument/2006/relationships" xmlns:m="http://schemas.openxmlformats.org/officeDocument/2006/math" xmlns:v="urn:schemas-microsoft-com:vml" xmlns:wp14="http://schemas.microsoft.com/office/word/2010/wordprocessingDrawing" xmlns:wp="http://schemas.openxmlformats.org/drawingml/2006/wordprocessingDrawing" xmlns:w10="urn:schemas-microsoft-com:office:word" xmlns:w="http://schemas.openxmlformats.org/wordprocessingml/2006/main" xmlns:w14="http://schemas.microsoft.com/office/word/2010/wordml" xmlns:w15="http://schemas.microsoft.com/office/word/2012/wordml" xmlns:w16cex="http://schemas.microsoft.com/office/word/2018/wordml/cex" xmlns:w16cid="http://schemas.microsoft.com/office/word/2016/wordml/cid" xmlns:w16="http://schemas.microsoft.com/office/word/2018/wordml" xmlns:w16du="http://schemas.microsoft.com/office/word/2023/wordml/word16du" xmlns:w16sdtdh="http://schemas.microsoft.com/office/word/2020/wordml/sdtdatahash" xmlns:w16se="http://schemas.microsoft.com/office/word/2015/wordml/symex" xmlns:wpg="http://schemas.microsoft.com/office/word/2010/wordprocessingGroup" xmlns:wpi="http://schemas.microsoft.com/office/word/2010/wordprocessingInk" xmlns:wne="http://schemas.microsoft.com/office/word/2006/wordml" xmlns:wps="http://schemas.microsoft.com/office/word/2010/wordprocessingShape" mc:Ignorable="w14 w15 w16se w16cid w16 w16cex w16sdtdh w16du wp14">
+  <w:tbl>
+    <w:tblPr>
+      <w:tblStyle w:val="Tablaconcuadrcula"/>
+      <w:tblW w:w="0" w:type="auto"/>
+      <w:tblBorders>
+        <w:top w:val="none" w:sz="0" w:space="0" w:color="auto"/>
+        <w:left w:val="none" w:sz="0" w:space="0" w:color="auto"/>
+        <w:bottom w:val="none" w:sz="0" w:space="0" w:color="auto"/>
+        <w:right w:val="none" w:sz="0" w:space="0" w:color="auto"/>
+        <w:insideH w:val="none" w:sz="0" w:space="0" w:color="auto"/>
+        <w:insideV w:val="none" w:sz="0" w:space="0" w:color="auto"/>
+      </w:tblBorders>
+      <w:tblLook w:val="04A0" w:firstRow="1" w:lastRow="0" w:firstColumn="1" w:lastColumn="0" w:noHBand="0" w:noVBand="1"/>
+    </w:tblPr>
+    <w:tblGrid>
+      <w:gridCol w:w="6658"/>
+      <w:gridCol w:w="2170"/>
+    </w:tblGrid>
+    <w:tr>
+      <w:tc>
+        <w:tcPr>
+          <w:tcW w:w="6658" w:type="dxa"/>
+        </w:tcPr>
+        <w:p>
+          <w:pPr>
+            <w:pStyle w:val="Encabezado"/>
+            <w:tabs>
+              <w:tab w:val="right" w:pos="7371"/>
+            </w:tabs>
+            <w:ind w:right="-111"/>
+            <w:jc w:val="center"/>
+            <w:rPr>
+              <w:b/>
+              <w:bCs/>
+              <w:noProof/>
+            </w:rPr>
+          </w:pPr>
+          <w:r>
+            <w:rPr>
+              <w:b/>
+              <w:bCs/>
+              <w:noProof/>
+            </w:rPr>
+            <w:t>PROGRAMA INTERNO DE PROTECCIÓN CIVIL 2024</w:t>
+          </w:r>
+        </w:p>
+        <w:p>
+          <w:pPr>
+            <w:pStyle w:val="Encabezado"/>
+            <w:tabs>
+              <w:tab w:val="right" w:pos="7371"/>
+            </w:tabs>
+            <w:ind w:right="-111"/>
+            <w:jc w:val="center"/>
+            <w:rPr>
+              <w:b/>
+              <w:bCs/>
+              <w:noProof/>
+            </w:rPr>
+          </w:pPr>
+          <w:r>
+            <w:rPr>
+              <w:b/>
+              <w:bCs/>
+              <w:noProof/>
+            </w:rPr>
+            <w:t>{{ razon_social }}</w:t>
+          </w:r>
+        </w:p>
+        <w:p>
+          <w:pPr>
+            <w:pStyle w:val="Encabezado"/>
+            <w:tabs>
+              <w:tab w:val="center" w:pos="4003"/>
+              <w:tab w:val="right" w:pos="7371"/>
+            </w:tabs>
+            <w:ind w:right="-111"/>
+            <w:jc w:val="center"/>
+            <w:rPr>
+              <w:noProof/>
+            </w:rPr>
+          </w:pPr>
+          <w:r>
+            <w:rPr>
+              <w:b/>
+              <w:bCs/>
+              <w:noProof/>
+            </w:rPr>
+            <w:t>{{ nombre_comercial }}</w:t>
+          </w:r>
+        </w:p>
+      </w:tc>
+      <w:tc>
+        <w:tcPr>
+          <w:tcW w:w="2170" w:type="dxa"/>
+          <w:vAlign w:val="center"/>
+        </w:tcPr>
+        <w:p>
+          <w:pPr>
+            <w:pStyle w:val="Encabezado"/>
+            <w:tabs>
+              <w:tab w:val="right" w:pos="7371"/>
+            </w:tabs>
+            <w:jc w:val="center"/>
+            <w:rPr>
+              <w:noProof/>
+            </w:rPr>
+          </w:pPr>
+          <w:r>
+            <w:rPr>
+              <w:noProof/>
+            </w:rPr>
+            <w:t>{{ logo2 }}</w:t>
+          </w:r>
+        </w:p>
+      </w:tc>
+    </w:tr>
+  </w:tbl>
   <w:p>
     <w:pPr>
       <w:pStyle w:val="Encabezado"/>
-      <w:tabs>
-        <w:tab w:val="clear" w:pos="8838"/>
-        <w:tab w:val="right" w:pos="8222"/>
-        <w:tab w:val="left" w:pos="8647"/>
-      </w:tabs>
-      <w:ind w:right="1467"/>
-      <w:jc w:val="center"/>
-      <w:rPr>
-        <w:rFonts w:cstheme="minorHAnsi"/>
-        <w:b/>
-      </w:rPr>
     </w:pPr>
-    <w:r>
-      <w:rPr>
-        <w:noProof/>
-      </w:rPr>
-      <w:drawing>
-        <wp:anchor distT="0" distB="0" distL="114300" distR="114300" simplePos="0" relativeHeight="251667456" behindDoc="0" locked="0" layoutInCell="1" allowOverlap="1" wp14:anchorId="78E8E86B" wp14:editId="1A295353">
-          <wp:simplePos x="0" y="0"/>
-          <wp:positionH relativeFrom="margin">
-            <wp:align>right</wp:align>
-          </wp:positionH>
-          <wp:positionV relativeFrom="paragraph">
-            <wp:posOffset>-360680</wp:posOffset>
-          </wp:positionV>
-          <wp:extent cx="1013460" cy="1013460"/>
-          <wp:effectExtent l="0" t="0" r="0" b="0"/>
-          <wp:wrapNone/>
-          <wp:docPr id="843740038" name="Imagen 843740038"/>
-          <wp:cNvGraphicFramePr>
-            <a:graphicFrameLocks xmlns:a="http://schemas.openxmlformats.org/drawingml/2006/main" noChangeAspect="1"/>
-          </wp:cNvGraphicFramePr>
-          <a:graphic xmlns:a="http://schemas.openxmlformats.org/drawingml/2006/main">
-            <a:graphicData uri="http://schemas.openxmlformats.org/drawingml/2006/picture">
-              <pic:pic xmlns:pic="http://schemas.openxmlformats.org/drawingml/2006/picture">
-                <pic:nvPicPr>
-                  <pic:cNvPr id="29" name="Imagen 29"/>
-                  <pic:cNvPicPr/>
-                </pic:nvPicPr>
-                <pic:blipFill>
-                  <a:blip r:embed="rId1">
-                    <a:extLst>
-                      <a:ext uri="{28A0092B-C50C-407E-A947-70E740481C1C}">
-                        <a14:useLocalDpi xmlns:a14="http://schemas.microsoft.com/office/drawing/2010/main" val="0"/>
-                      </a:ext>
-                    </a:extLst>
-                  </a:blip>
-                  <a:stretch>
-                    <a:fillRect/>
-                  </a:stretch>
-                </pic:blipFill>
-                <pic:spPr>
-                  <a:xfrm>
-                    <a:off x="0" y="0"/>
-                    <a:ext cx="1013460" cy="1013460"/>
-                  </a:xfrm>
-                  <a:prstGeom prst="rect">
-                    <a:avLst/>
-                  </a:prstGeom>
-                </pic:spPr>
-              </pic:pic>
-            </a:graphicData>
-          </a:graphic>
-          <wp14:sizeRelH relativeFrom="margin">
-            <wp14:pctWidth>0</wp14:pctWidth>
-          </wp14:sizeRelH>
-          <wp14:sizeRelV relativeFrom="margin">
-            <wp14:pctHeight>0</wp14:pctHeight>
-          </wp14:sizeRelV>
-        </wp:anchor>
-      </w:drawing>
-    </w:r>
-    <w:r>
-      <w:rPr>
-        <w:rFonts w:cstheme="minorHAnsi"/>
-        <w:b/>
-      </w:rPr>
-      <w:t xml:space="preserve">PROGRAMA INTERNO DE PROTECCIÓN CIVIL </w:t>
-    </w:r>
-    <w:r>
-      <w:rPr>
-        <w:rFonts w:cstheme="minorHAnsi"/>
-        <w:b/>
-      </w:rPr>
-      <w:t>2024</w:t>
-    </w:r>
-  </w:p>
-  <w:p>
-    <w:pPr>
-      <w:pStyle w:val="Encabezado"/>
-      <w:tabs>
-        <w:tab w:val="clear" w:pos="8838"/>
-        <w:tab w:val="right" w:pos="8222"/>
-        <w:tab w:val="left" w:pos="8647"/>
-      </w:tabs>
-      <w:ind w:right="1467"/>
-      <w:jc w:val="center"/>
-      <w:rPr>
-        <w:rFonts w:cstheme="minorHAnsi"/>
-        <w:b/>
-      </w:rPr>
-    </w:pPr>
-    <w:proofErr w:type="gramStart"/>
-    <w:r>
-      <w:rPr>
-        <w:rFonts w:cstheme="minorHAnsi"/>
-        <w:b/>
-      </w:rPr>
-      <w:t xml:space="preserve">{{ </w:t>
-    </w:r>
-    <w:proofErr w:type="spellStart"/>
-    <w:r>
-      <w:rPr>
-        <w:rFonts w:cstheme="minorHAnsi"/>
-        <w:b/>
-      </w:rPr>
-      <w:t>r</w:t>
-    </w:r>
-    <w:r>
-      <w:rPr>
-        <w:rFonts w:cstheme="minorHAnsi"/>
-        <w:b/>
-      </w:rPr>
-      <w:t>azon</w:t>
-    </w:r>
-    <w:proofErr w:type="gramEnd"/>
-    <w:r>
-      <w:rPr>
-        <w:rFonts w:cstheme="minorHAnsi"/>
-        <w:b/>
-      </w:rPr>
-      <w:t>_social</w:t>
-    </w:r>
-    <w:proofErr w:type="spellEnd"/>
-    <w:r>
-      <w:rPr>
-        <w:rFonts w:cstheme="minorHAnsi"/>
-        <w:b/>
-      </w:rPr>
-      <w:t xml:space="preserve"> }}</w:t>
-    </w:r>
-  </w:p>
-  <w:p>
-    <w:pPr>
-      <w:ind w:right="1467"/>
-      <w:jc w:val="center"/>
-      <w:rPr>
-        <w:b/>
-      </w:rPr>
-    </w:pPr>
-    <w:proofErr w:type="gramStart"/>
-    <w:r>
-      <w:rPr>
-        <w:b/>
-      </w:rPr>
-      <w:t xml:space="preserve">{{ </w:t>
-    </w:r>
-    <w:proofErr w:type="spellStart"/>
-    <w:r>
-      <w:rPr>
-        <w:b/>
-      </w:rPr>
-      <w:t>n</w:t>
-    </w:r>
-    <w:r>
-      <w:rPr>
-        <w:b/>
-      </w:rPr>
-      <w:t>ombre</w:t>
-    </w:r>
-    <w:proofErr w:type="gramEnd"/>
-    <w:r>
-      <w:rPr>
-        <w:b/>
-      </w:rPr>
-      <w:t>_comercial</w:t>
-    </w:r>
-    <w:proofErr w:type="spellEnd"/>
-    <w:r>
-      <w:rPr>
-        <w:b/>
-      </w:rPr>
-      <w:t xml:space="preserve"> }}</w:t>
-    </w:r>
   </w:p>
 </w:hdr>
 </file>
 
 <file path=word/header2.xml><?xml version="1.0" encoding="utf-8"?>
-<w:hdr xmlns:wpc="http://schemas.microsoft.com/office/word/2010/wordprocessingCanvas" xmlns:cx="http://schemas.microsoft.com/office/drawing/2014/chartex" xmlns:cx1="http://schemas.microsoft.com/office/drawing/2015/9/8/chartex" xmlns:cx2="http://schemas.microsoft.com/office/drawing/2015/10/21/chartex" xmlns:cx3="http://schemas.microsoft.com/office/drawing/2016/5/9/chartex" xmlns:cx4="http://schemas.microsoft.com/office/drawing/2016/5/10/chartex" xmlns:cx5="http://schemas.microsoft.com/office/drawing/2016/5/11/chartex" xmlns:cx6="http://schemas.microsoft.com/office/drawing/2016/5/12/chartex" xmlns:cx7="http://schemas.microsoft.com/office/drawing/2016/5/13/chartex" xmlns:cx8="http://schemas.microsoft.com/office/drawing/2016/5/14/chartex" xmlns:mc="http://schemas.openxmlformats.org/markup-compatibility/2006" xmlns:aink="http://schemas.microsoft.com/office/drawing/2016/ink" xmlns:am3d="http://schemas.microsoft.com/office/drawing/2017/model3d" xmlns:o="urn:schemas-microsoft-com:office:office" xmlns:oel="http://schemas.microsoft.com/office/2019/extlst" xmlns:r="http://schemas.openxmlformats.org/officeDocument/2006/relationships" xmlns:m="http://schemas.openxmlformats.org/officeDocument/2006/math" xmlns:v="urn:schemas-microsoft-com:vml" xmlns:wp14="http://schemas.microsoft.com/office/word/2010/wordprocessingDrawing" xmlns:wp="http://schemas.openxmlformats.org/drawingml/2006/wordprocessingDrawing" xmlns:w10="urn:schemas-microsoft-com:office:word" xmlns:w="http://schemas.openxmlformats.org/wordprocessingml/2006/main" xmlns:w14="http://schemas.microsoft.com/office/word/2010/wordml" xmlns:w15="http://schemas.microsoft.com/office/word/2012/wordml" xmlns:w16cex="http://schemas.microsoft.com/office/word/2018/wordml/cex" xmlns:w16cid="http://schemas.microsoft.com/office/word/2016/wordml/cid" xmlns:w16="http://schemas.microsoft.com/office/word/2018/wordml" xmlns:w16sdtdh="http://schemas.microsoft.com/office/word/2020/wordml/sdtdatahash" xmlns:w16se="http://schemas.microsoft.com/office/word/2015/wordml/symex" xmlns:wpg="http://schemas.microsoft.com/office/word/2010/wordprocessingGroup" xmlns:wpi="http://schemas.microsoft.com/office/word/2010/wordprocessingInk" xmlns:wne="http://schemas.microsoft.com/office/word/2006/wordml" xmlns:wps="http://schemas.microsoft.com/office/word/2010/wordprocessingShape" mc:Ignorable="w14 w15 w16se w16cid w16 w16cex w16sdtdh wp14">
+<w:hdr xmlns:wpc="http://schemas.microsoft.com/office/word/2010/wordprocessingCanvas" xmlns:cx="http://schemas.microsoft.com/office/drawing/2014/chartex" xmlns:cx1="http://schemas.microsoft.com/office/drawing/2015/9/8/chartex" xmlns:cx2="http://schemas.microsoft.com/office/drawing/2015/10/21/chartex" xmlns:cx3="http://schemas.microsoft.com/office/drawing/2016/5/9/chartex" xmlns:cx4="http://schemas.microsoft.com/office/drawing/2016/5/10/chartex" xmlns:cx5="http://schemas.microsoft.com/office/drawing/2016/5/11/chartex" xmlns:cx6="http://schemas.microsoft.com/office/drawing/2016/5/12/chartex" xmlns:cx7="http://schemas.microsoft.com/office/drawing/2016/5/13/chartex" xmlns:cx8="http://schemas.microsoft.com/office/drawing/2016/5/14/chartex" xmlns:mc="http://schemas.openxmlformats.org/markup-compatibility/2006" xmlns:aink="http://schemas.microsoft.com/office/drawing/2016/ink" xmlns:am3d="http://schemas.microsoft.com/office/drawing/2017/model3d" xmlns:o="urn:schemas-microsoft-com:office:office" xmlns:oel="http://schemas.microsoft.com/office/2019/extlst" xmlns:r="http://schemas.openxmlformats.org/officeDocument/2006/relationships" xmlns:m="http://schemas.openxmlformats.org/officeDocument/2006/math" xmlns:v="urn:schemas-microsoft-com:vml" xmlns:wp14="http://schemas.microsoft.com/office/word/2010/wordprocessingDrawing" xmlns:wp="http://schemas.openxmlformats.org/drawingml/2006/wordprocessingDrawing" xmlns:w10="urn:schemas-microsoft-com:office:word" xmlns:w="http://schemas.openxmlformats.org/wordprocessingml/2006/main" xmlns:w14="http://schemas.microsoft.com/office/word/2010/wordml" xmlns:w15="http://schemas.microsoft.com/office/word/2012/wordml" xmlns:w16cex="http://schemas.microsoft.com/office/word/2018/wordml/cex" xmlns:w16cid="http://schemas.microsoft.com/office/word/2016/wordml/cid" xmlns:w16="http://schemas.microsoft.com/office/word/2018/wordml" xmlns:w16du="http://schemas.microsoft.com/office/word/2023/wordml/word16du" xmlns:w16sdtdh="http://schemas.microsoft.com/office/word/2020/wordml/sdtdatahash" xmlns:w16se="http://schemas.microsoft.com/office/word/2015/wordml/symex" xmlns:wpg="http://schemas.microsoft.com/office/word/2010/wordprocessingGroup" xmlns:wpi="http://schemas.microsoft.com/office/word/2010/wordprocessingInk" xmlns:wne="http://schemas.microsoft.com/office/word/2006/wordml" xmlns:wps="http://schemas.microsoft.com/office/word/2010/wordprocessingShape" mc:Ignorable="w14 w15 w16se w16cid w16 w16cex w16sdtdh w16du wp14">
   <w:p>
     <w:pPr>
       <w:pStyle w:val="Encabezado"/>
@@ -13980,7 +13917,7 @@
 </file>
 
 <file path=word/numbering.xml><?xml version="1.0" encoding="utf-8"?>
-<w:numbering xmlns:wpc="http://schemas.microsoft.com/office/word/2010/wordprocessingCanvas" xmlns:cx="http://schemas.microsoft.com/office/drawing/2014/chartex" xmlns:cx1="http://schemas.microsoft.com/office/drawing/2015/9/8/chartex" xmlns:cx2="http://schemas.microsoft.com/office/drawing/2015/10/21/chartex" xmlns:cx3="http://schemas.microsoft.com/office/drawing/2016/5/9/chartex" xmlns:cx4="http://schemas.microsoft.com/office/drawing/2016/5/10/chartex" xmlns:cx5="http://schemas.microsoft.com/office/drawing/2016/5/11/chartex" xmlns:cx6="http://schemas.microsoft.com/office/drawing/2016/5/12/chartex" xmlns:cx7="http://schemas.microsoft.com/office/drawing/2016/5/13/chartex" xmlns:cx8="http://schemas.microsoft.com/office/drawing/2016/5/14/chartex" xmlns:mc="http://schemas.openxmlformats.org/markup-compatibility/2006" xmlns:aink="http://schemas.microsoft.com/office/drawing/2016/ink" xmlns:am3d="http://schemas.microsoft.com/office/drawing/2017/model3d" xmlns:o="urn:schemas-microsoft-com:office:office" xmlns:oel="http://schemas.microsoft.com/office/2019/extlst" xmlns:r="http://schemas.openxmlformats.org/officeDocument/2006/relationships" xmlns:m="http://schemas.openxmlformats.org/officeDocument/2006/math" xmlns:v="urn:schemas-microsoft-com:vml" xmlns:wp14="http://schemas.microsoft.com/office/word/2010/wordprocessingDrawing" xmlns:wp="http://schemas.openxmlformats.org/drawingml/2006/wordprocessingDrawing" xmlns:w10="urn:schemas-microsoft-com:office:word" xmlns:w="http://schemas.openxmlformats.org/wordprocessingml/2006/main" xmlns:w14="http://schemas.microsoft.com/office/word/2010/wordml" xmlns:w15="http://schemas.microsoft.com/office/word/2012/wordml" xmlns:w16cex="http://schemas.microsoft.com/office/word/2018/wordml/cex" xmlns:w16cid="http://schemas.microsoft.com/office/word/2016/wordml/cid" xmlns:w16="http://schemas.microsoft.com/office/word/2018/wordml" xmlns:w16sdtdh="http://schemas.microsoft.com/office/word/2020/wordml/sdtdatahash" xmlns:w16se="http://schemas.microsoft.com/office/word/2015/wordml/symex" xmlns:wpg="http://schemas.microsoft.com/office/word/2010/wordprocessingGroup" xmlns:wpi="http://schemas.microsoft.com/office/word/2010/wordprocessingInk" xmlns:wne="http://schemas.microsoft.com/office/word/2006/wordml" xmlns:wps="http://schemas.microsoft.com/office/word/2010/wordprocessingShape" mc:Ignorable="w14 w15 w16se w16cid w16 w16cex w16sdtdh wp14">
+<w:numbering xmlns:wpc="http://schemas.microsoft.com/office/word/2010/wordprocessingCanvas" xmlns:cx="http://schemas.microsoft.com/office/drawing/2014/chartex" xmlns:cx1="http://schemas.microsoft.com/office/drawing/2015/9/8/chartex" xmlns:cx2="http://schemas.microsoft.com/office/drawing/2015/10/21/chartex" xmlns:cx3="http://schemas.microsoft.com/office/drawing/2016/5/9/chartex" xmlns:cx4="http://schemas.microsoft.com/office/drawing/2016/5/10/chartex" xmlns:cx5="http://schemas.microsoft.com/office/drawing/2016/5/11/chartex" xmlns:cx6="http://schemas.microsoft.com/office/drawing/2016/5/12/chartex" xmlns:cx7="http://schemas.microsoft.com/office/drawing/2016/5/13/chartex" xmlns:cx8="http://schemas.microsoft.com/office/drawing/2016/5/14/chartex" xmlns:mc="http://schemas.openxmlformats.org/markup-compatibility/2006" xmlns:aink="http://schemas.microsoft.com/office/drawing/2016/ink" xmlns:am3d="http://schemas.microsoft.com/office/drawing/2017/model3d" xmlns:o="urn:schemas-microsoft-com:office:office" xmlns:oel="http://schemas.microsoft.com/office/2019/extlst" xmlns:r="http://schemas.openxmlformats.org/officeDocument/2006/relationships" xmlns:m="http://schemas.openxmlformats.org/officeDocument/2006/math" xmlns:v="urn:schemas-microsoft-com:vml" xmlns:wp14="http://schemas.microsoft.com/office/word/2010/wordprocessingDrawing" xmlns:wp="http://schemas.openxmlformats.org/drawingml/2006/wordprocessingDrawing" xmlns:w10="urn:schemas-microsoft-com:office:word" xmlns:w="http://schemas.openxmlformats.org/wordprocessingml/2006/main" xmlns:w14="http://schemas.microsoft.com/office/word/2010/wordml" xmlns:w15="http://schemas.microsoft.com/office/word/2012/wordml" xmlns:w16cex="http://schemas.microsoft.com/office/word/2018/wordml/cex" xmlns:w16cid="http://schemas.microsoft.com/office/word/2016/wordml/cid" xmlns:w16="http://schemas.microsoft.com/office/word/2018/wordml" xmlns:w16du="http://schemas.microsoft.com/office/word/2023/wordml/word16du" xmlns:w16sdtdh="http://schemas.microsoft.com/office/word/2020/wordml/sdtdatahash" xmlns:w16se="http://schemas.microsoft.com/office/word/2015/wordml/symex" xmlns:wpg="http://schemas.microsoft.com/office/word/2010/wordprocessingGroup" xmlns:wpi="http://schemas.microsoft.com/office/word/2010/wordprocessingInk" xmlns:wne="http://schemas.microsoft.com/office/word/2006/wordml" xmlns:wps="http://schemas.microsoft.com/office/word/2010/wordprocessingShape" mc:Ignorable="w14 w15 w16se w16cid w16 w16cex w16sdtdh w16du wp14">
   <w:abstractNum w:abstractNumId="0" w15:restartNumberingAfterBreak="0">
     <w:nsid w:val="FFFFFF89"/>
     <w:multiLevelType w:val="singleLevel"/>
@@ -14244,7 +14181,7 @@
 </file>
 
 <file path=word/styles.xml><?xml version="1.0" encoding="utf-8"?>
-<w:styles xmlns:mc="http://schemas.openxmlformats.org/markup-compatibility/2006" xmlns:r="http://schemas.openxmlformats.org/officeDocument/2006/relationships" xmlns:w="http://schemas.openxmlformats.org/wordprocessingml/2006/main" xmlns:w14="http://schemas.microsoft.com/office/word/2010/wordml" xmlns:w15="http://schemas.microsoft.com/office/word/2012/wordml" xmlns:w16cex="http://schemas.microsoft.com/office/word/2018/wordml/cex" xmlns:w16cid="http://schemas.microsoft.com/office/word/2016/wordml/cid" xmlns:w16="http://schemas.microsoft.com/office/word/2018/wordml" xmlns:w16sdtdh="http://schemas.microsoft.com/office/word/2020/wordml/sdtdatahash" xmlns:w16se="http://schemas.microsoft.com/office/word/2015/wordml/symex" mc:Ignorable="w14 w15 w16se w16cid w16 w16cex w16sdtdh">
+<w:styles xmlns:mc="http://schemas.openxmlformats.org/markup-compatibility/2006" xmlns:r="http://schemas.openxmlformats.org/officeDocument/2006/relationships" xmlns:w="http://schemas.openxmlformats.org/wordprocessingml/2006/main" xmlns:w14="http://schemas.microsoft.com/office/word/2010/wordml" xmlns:w15="http://schemas.microsoft.com/office/word/2012/wordml" xmlns:w16cex="http://schemas.microsoft.com/office/word/2018/wordml/cex" xmlns:w16cid="http://schemas.microsoft.com/office/word/2016/wordml/cid" xmlns:w16="http://schemas.microsoft.com/office/word/2018/wordml" xmlns:w16du="http://schemas.microsoft.com/office/word/2023/wordml/word16du" xmlns:w16sdtdh="http://schemas.microsoft.com/office/word/2020/wordml/sdtdatahash" xmlns:w16se="http://schemas.microsoft.com/office/word/2015/wordml/symex" mc:Ignorable="w14 w15 w16se w16cid w16 w16cex w16sdtdh w16du">
   <w:docDefaults>
     <w:rPrDefault>
       <w:rPr>
@@ -14415,7 +14352,7 @@
     <w:lsdException w:name="Table Web 2" w:semiHidden="1" w:unhideWhenUsed="1"/>
     <w:lsdException w:name="Table Web 3" w:semiHidden="1" w:unhideWhenUsed="1"/>
     <w:lsdException w:name="Balloon Text" w:semiHidden="1" w:unhideWhenUsed="1"/>
-    <w:lsdException w:name="Table Grid" w:uiPriority="39"/>
+    <w:lsdException w:name="Table Grid" w:uiPriority="59"/>
     <w:lsdException w:name="Table Theme" w:semiHidden="1" w:unhideWhenUsed="1"/>
     <w:lsdException w:name="Placeholder Text" w:semiHidden="1"/>
     <w:lsdException w:name="No Spacing" w:uiPriority="1" w:qFormat="1"/>
@@ -15106,7 +15043,7 @@
   <w:style w:type="table" w:styleId="Tablaconcuadrcula">
     <w:name w:val="Table Grid"/>
     <w:basedOn w:val="Tablanormal"/>
-    <w:uiPriority w:val="39"/>
+    <w:uiPriority w:val="59"/>
     <w:rsid w:val="00B379A0"/>
     <w:pPr>
       <w:spacing w:after="0" w:line="240" w:lineRule="auto"/>

</xml_diff>